<commit_message>
feat: integrate Quiz Duel, AI routes, Exam simulators, and Agile artifacts
</commit_message>
<xml_diff>
--- a/MindSprint_Project_Documentation.docx
+++ b/MindSprint_Project_Documentation.docx
@@ -4283,6 +4283,646 @@
           <w:sz w:val="19"/>
         </w:rPr>
         <w:t>Figure 4.8: Student Profile, Gamification Badges &amp; Theme Configuration</w:t>
+      </w:r>
+    </w:p>
+    <w:p>
+      <w:pPr>
+        <w:spacing w:before="360" w:after="120"/>
+      </w:pPr>
+      <w:r>
+        <w:rPr>
+          <w:b/>
+          <w:color w:val="1A365D"/>
+          <w:sz w:val="32"/>
+        </w:rPr>
+        <w:t>5. Agile Documentation</w:t>
+      </w:r>
+    </w:p>
+    <w:p>
+      <w:pPr>
+        <w:spacing w:after="240"/>
+      </w:pPr>
+      <w:r>
+        <w:rPr>
+          <w:sz w:val="22"/>
+        </w:rPr>
+        <w:t>The following sections present the Agile Project Management artifacts developed for MindSprint, covering the project charter, sprint roadmaps, execution plan, user stories, release schedule, backlog tracking, test execution, and burndown velocity metrics:</w:t>
+      </w:r>
+    </w:p>
+    <w:p>
+      <w:pPr>
+        <w:spacing w:before="280" w:after="80"/>
+      </w:pPr>
+      <w:r>
+        <w:rPr>
+          <w:b/>
+          <w:sz w:val="26"/>
+        </w:rPr>
+        <w:t>5.1 Agile Project Charter</w:t>
+      </w:r>
+    </w:p>
+    <w:p>
+      <w:pPr>
+        <w:spacing w:after="120"/>
+      </w:pPr>
+      <w:r>
+        <w:rPr>
+          <w:sz w:val="22"/>
+        </w:rPr>
+        <w:t>The Agile Project Charter establishes the project scope, vision, mission, mentor oversight, and boundaries for the MindSprint placement preparation and skill learning platform.</w:t>
+      </w:r>
+    </w:p>
+    <w:p>
+      <w:pPr>
+        <w:spacing w:after="80"/>
+        <w:jc w:val="center"/>
+      </w:pPr>
+      <w:r>
+        <w:drawing>
+          <wp:inline xmlns:a="http://schemas.openxmlformats.org/drawingml/2006/main" xmlns:pic="http://schemas.openxmlformats.org/drawingml/2006/picture">
+            <wp:extent cx="5669280" cy="3526917"/>
+            <wp:docPr id="13" name="Picture 13"/>
+            <wp:cNvGraphicFramePr>
+              <a:graphicFrameLocks noChangeAspect="1"/>
+            </wp:cNvGraphicFramePr>
+            <a:graphic>
+              <a:graphicData uri="http://schemas.openxmlformats.org/drawingml/2006/picture">
+                <pic:pic>
+                  <pic:nvPicPr>
+                    <pic:cNvPr id="0" name="agile_01_project_charter.png"/>
+                    <pic:cNvPicPr/>
+                  </pic:nvPicPr>
+                  <pic:blipFill>
+                    <a:blip r:embed="rId20"/>
+                    <a:stretch>
+                      <a:fillRect/>
+                    </a:stretch>
+                  </pic:blipFill>
+                  <pic:spPr>
+                    <a:xfrm>
+                      <a:off x="0" y="0"/>
+                      <a:ext cx="5669280" cy="3526917"/>
+                    </a:xfrm>
+                    <a:prstGeom prst="rect"/>
+                  </pic:spPr>
+                </pic:pic>
+              </a:graphicData>
+            </a:graphic>
+          </wp:inline>
+        </w:drawing>
+      </w:r>
+    </w:p>
+    <w:p>
+      <w:pPr>
+        <w:spacing w:after="280"/>
+        <w:jc w:val="center"/>
+      </w:pPr>
+      <w:r>
+        <w:rPr>
+          <w:i/>
+          <w:color w:val="555555"/>
+          <w:sz w:val="20"/>
+        </w:rPr>
+        <w:t>Figure 5.1: Agile Project Charter - MindSprint System</w:t>
+      </w:r>
+    </w:p>
+    <w:p>
+      <w:pPr>
+        <w:spacing w:before="280" w:after="80"/>
+      </w:pPr>
+      <w:r>
+        <w:rPr>
+          <w:b/>
+          <w:sz w:val="26"/>
+        </w:rPr>
+        <w:t>5.2 Agile Roadmap / Schedule</w:t>
+      </w:r>
+    </w:p>
+    <w:p>
+      <w:pPr>
+        <w:spacing w:after="120"/>
+      </w:pPr>
+      <w:r>
+        <w:rPr>
+          <w:sz w:val="22"/>
+        </w:rPr>
+        <w:t>The Agile Roadmap provides a high-level sprint schedule detailing phase timelines, monthly targets, focus modules, and sprint leadership from July 22, 2026 onwards.</w:t>
+      </w:r>
+    </w:p>
+    <w:p>
+      <w:pPr>
+        <w:spacing w:after="80"/>
+        <w:jc w:val="center"/>
+      </w:pPr>
+      <w:r>
+        <w:drawing>
+          <wp:inline xmlns:a="http://schemas.openxmlformats.org/drawingml/2006/main" xmlns:pic="http://schemas.openxmlformats.org/drawingml/2006/picture">
+            <wp:extent cx="5669280" cy="2813757"/>
+            <wp:docPr id="14" name="Picture 14"/>
+            <wp:cNvGraphicFramePr>
+              <a:graphicFrameLocks noChangeAspect="1"/>
+            </wp:cNvGraphicFramePr>
+            <a:graphic>
+              <a:graphicData uri="http://schemas.openxmlformats.org/drawingml/2006/picture">
+                <pic:pic>
+                  <pic:nvPicPr>
+                    <pic:cNvPr id="0" name="agile_02_project_roadmap.png"/>
+                    <pic:cNvPicPr/>
+                  </pic:nvPicPr>
+                  <pic:blipFill>
+                    <a:blip r:embed="rId21"/>
+                    <a:stretch>
+                      <a:fillRect/>
+                    </a:stretch>
+                  </pic:blipFill>
+                  <pic:spPr>
+                    <a:xfrm>
+                      <a:off x="0" y="0"/>
+                      <a:ext cx="5669280" cy="2813757"/>
+                    </a:xfrm>
+                    <a:prstGeom prst="rect"/>
+                  </pic:spPr>
+                </pic:pic>
+              </a:graphicData>
+            </a:graphic>
+          </wp:inline>
+        </w:drawing>
+      </w:r>
+    </w:p>
+    <w:p>
+      <w:pPr>
+        <w:spacing w:after="280"/>
+        <w:jc w:val="center"/>
+      </w:pPr>
+      <w:r>
+        <w:rPr>
+          <w:i/>
+          <w:color w:val="555555"/>
+          <w:sz w:val="20"/>
+        </w:rPr>
+        <w:t>Figure 5.2: Agile Roadmap &amp; Sprint Schedule - MindSprint</w:t>
+      </w:r>
+    </w:p>
+    <w:p>
+      <w:pPr>
+        <w:spacing w:before="280" w:after="80"/>
+      </w:pPr>
+      <w:r>
+        <w:rPr>
+          <w:b/>
+          <w:sz w:val="26"/>
+        </w:rPr>
+        <w:t>5.3 Agile Project Plan</w:t>
+      </w:r>
+    </w:p>
+    <w:p>
+      <w:pPr>
+        <w:spacing w:after="120"/>
+      </w:pPr>
+      <w:r>
+        <w:rPr>
+          <w:sz w:val="22"/>
+        </w:rPr>
+        <w:t>The Agile Project Plan tracks task-level breakdown across Sprints 1 to 6, team member assignments (Dhruv, Dvarkesh, Krunal), start dates, duration, and completion statuses.</w:t>
+      </w:r>
+    </w:p>
+    <w:p>
+      <w:pPr>
+        <w:spacing w:after="80"/>
+        <w:jc w:val="center"/>
+      </w:pPr>
+      <w:r>
+        <w:drawing>
+          <wp:inline xmlns:a="http://schemas.openxmlformats.org/drawingml/2006/main" xmlns:pic="http://schemas.openxmlformats.org/drawingml/2006/picture">
+            <wp:extent cx="5669280" cy="3764707"/>
+            <wp:docPr id="15" name="Picture 15"/>
+            <wp:cNvGraphicFramePr>
+              <a:graphicFrameLocks noChangeAspect="1"/>
+            </wp:cNvGraphicFramePr>
+            <a:graphic>
+              <a:graphicData uri="http://schemas.openxmlformats.org/drawingml/2006/picture">
+                <pic:pic>
+                  <pic:nvPicPr>
+                    <pic:cNvPr id="0" name="agile_03_project_plan.png"/>
+                    <pic:cNvPicPr/>
+                  </pic:nvPicPr>
+                  <pic:blipFill>
+                    <a:blip r:embed="rId22"/>
+                    <a:stretch>
+                      <a:fillRect/>
+                    </a:stretch>
+                  </pic:blipFill>
+                  <pic:spPr>
+                    <a:xfrm>
+                      <a:off x="0" y="0"/>
+                      <a:ext cx="5669280" cy="3764707"/>
+                    </a:xfrm>
+                    <a:prstGeom prst="rect"/>
+                  </pic:spPr>
+                </pic:pic>
+              </a:graphicData>
+            </a:graphic>
+          </wp:inline>
+        </w:drawing>
+      </w:r>
+    </w:p>
+    <w:p>
+      <w:pPr>
+        <w:spacing w:after="280"/>
+        <w:jc w:val="center"/>
+      </w:pPr>
+      <w:r>
+        <w:rPr>
+          <w:i/>
+          <w:color w:val="555555"/>
+          <w:sz w:val="20"/>
+        </w:rPr>
+        <w:t>Figure 5.3: Agile Project Plan &amp; Work Breakdown Structure</w:t>
+      </w:r>
+    </w:p>
+    <w:p>
+      <w:pPr>
+        <w:spacing w:before="280" w:after="80"/>
+      </w:pPr>
+      <w:r>
+        <w:rPr>
+          <w:b/>
+          <w:sz w:val="26"/>
+        </w:rPr>
+        <w:t>5.4 User Stories</w:t>
+      </w:r>
+    </w:p>
+    <w:p>
+      <w:pPr>
+        <w:spacing w:after="120"/>
+      </w:pPr>
+      <w:r>
+        <w:rPr>
+          <w:sz w:val="22"/>
+        </w:rPr>
+        <w:t>The Agile User Stories capture user requirements from student, job seeker, placement aspirant, and administrator personas, defining business goals, tasks, and priorities.</w:t>
+      </w:r>
+    </w:p>
+    <w:p>
+      <w:pPr>
+        <w:spacing w:after="80"/>
+        <w:jc w:val="center"/>
+      </w:pPr>
+      <w:r>
+        <w:drawing>
+          <wp:inline xmlns:a="http://schemas.openxmlformats.org/drawingml/2006/main" xmlns:pic="http://schemas.openxmlformats.org/drawingml/2006/picture">
+            <wp:extent cx="5669280" cy="3131965"/>
+            <wp:docPr id="16" name="Picture 16"/>
+            <wp:cNvGraphicFramePr>
+              <a:graphicFrameLocks noChangeAspect="1"/>
+            </wp:cNvGraphicFramePr>
+            <a:graphic>
+              <a:graphicData uri="http://schemas.openxmlformats.org/drawingml/2006/picture">
+                <pic:pic>
+                  <pic:nvPicPr>
+                    <pic:cNvPr id="0" name="agile_04_user_stories.png"/>
+                    <pic:cNvPicPr/>
+                  </pic:nvPicPr>
+                  <pic:blipFill>
+                    <a:blip r:embed="rId23"/>
+                    <a:stretch>
+                      <a:fillRect/>
+                    </a:stretch>
+                  </pic:blipFill>
+                  <pic:spPr>
+                    <a:xfrm>
+                      <a:off x="0" y="0"/>
+                      <a:ext cx="5669280" cy="3131965"/>
+                    </a:xfrm>
+                    <a:prstGeom prst="rect"/>
+                  </pic:spPr>
+                </pic:pic>
+              </a:graphicData>
+            </a:graphic>
+          </wp:inline>
+        </w:drawing>
+      </w:r>
+    </w:p>
+    <w:p>
+      <w:pPr>
+        <w:spacing w:after="280"/>
+        <w:jc w:val="center"/>
+      </w:pPr>
+      <w:r>
+        <w:rPr>
+          <w:i/>
+          <w:color w:val="555555"/>
+          <w:sz w:val="20"/>
+        </w:rPr>
+        <w:t>Figure 5.4: Agile User Stories &amp; Acceptance Criteria</w:t>
+      </w:r>
+    </w:p>
+    <w:p>
+      <w:pPr>
+        <w:spacing w:before="280" w:after="80"/>
+      </w:pPr>
+      <w:r>
+        <w:rPr>
+          <w:b/>
+          <w:sz w:val="26"/>
+        </w:rPr>
+        <w:t>5.5 Release Plan</w:t>
+      </w:r>
+    </w:p>
+    <w:p>
+      <w:pPr>
+        <w:spacing w:after="120"/>
+      </w:pPr>
+      <w:r>
+        <w:rPr>
+          <w:sz w:val="22"/>
+        </w:rPr>
+        <w:t>The Agile Release Plan defines release milestones (Releases 1.0 through 1.5) and target deployment windows across the incremental development sprints.</w:t>
+      </w:r>
+    </w:p>
+    <w:p>
+      <w:pPr>
+        <w:spacing w:after="80"/>
+        <w:jc w:val="center"/>
+      </w:pPr>
+      <w:r>
+        <w:drawing>
+          <wp:inline xmlns:a="http://schemas.openxmlformats.org/drawingml/2006/main" xmlns:pic="http://schemas.openxmlformats.org/drawingml/2006/picture">
+            <wp:extent cx="5669280" cy="3033581"/>
+            <wp:docPr id="17" name="Picture 17"/>
+            <wp:cNvGraphicFramePr>
+              <a:graphicFrameLocks noChangeAspect="1"/>
+            </wp:cNvGraphicFramePr>
+            <a:graphic>
+              <a:graphicData uri="http://schemas.openxmlformats.org/drawingml/2006/picture">
+                <pic:pic>
+                  <pic:nvPicPr>
+                    <pic:cNvPr id="0" name="agile_05_release_plan.png"/>
+                    <pic:cNvPicPr/>
+                  </pic:nvPicPr>
+                  <pic:blipFill>
+                    <a:blip r:embed="rId24"/>
+                    <a:stretch>
+                      <a:fillRect/>
+                    </a:stretch>
+                  </pic:blipFill>
+                  <pic:spPr>
+                    <a:xfrm>
+                      <a:off x="0" y="0"/>
+                      <a:ext cx="5669280" cy="3033581"/>
+                    </a:xfrm>
+                    <a:prstGeom prst="rect"/>
+                  </pic:spPr>
+                </pic:pic>
+              </a:graphicData>
+            </a:graphic>
+          </wp:inline>
+        </w:drawing>
+      </w:r>
+    </w:p>
+    <w:p>
+      <w:pPr>
+        <w:spacing w:after="280"/>
+        <w:jc w:val="center"/>
+      </w:pPr>
+      <w:r>
+        <w:rPr>
+          <w:i/>
+          <w:color w:val="555555"/>
+          <w:sz w:val="20"/>
+        </w:rPr>
+        <w:t>Figure 5.5: Agile Release Plan &amp; Milestone Deliverables</w:t>
+      </w:r>
+    </w:p>
+    <w:p>
+      <w:pPr>
+        <w:spacing w:before="280" w:after="80"/>
+      </w:pPr>
+      <w:r>
+        <w:rPr>
+          <w:b/>
+          <w:sz w:val="26"/>
+        </w:rPr>
+        <w:t>5.6 Product Backlog &amp; Sprint Backlog</w:t>
+      </w:r>
+    </w:p>
+    <w:p>
+      <w:pPr>
+        <w:spacing w:after="120"/>
+      </w:pPr>
+      <w:r>
+        <w:rPr>
+          <w:sz w:val="22"/>
+        </w:rPr>
+        <w:t>The Product Backlog and Sprint Backlogs detail story point estimations, sprint readiness, priority hierarchy, and team assignments for each software deliverable.</w:t>
+      </w:r>
+    </w:p>
+    <w:p>
+      <w:pPr>
+        <w:spacing w:after="80"/>
+        <w:jc w:val="center"/>
+      </w:pPr>
+      <w:r>
+        <w:drawing>
+          <wp:inline xmlns:a="http://schemas.openxmlformats.org/drawingml/2006/main" xmlns:pic="http://schemas.openxmlformats.org/drawingml/2006/picture">
+            <wp:extent cx="5669280" cy="3553087"/>
+            <wp:docPr id="18" name="Picture 18"/>
+            <wp:cNvGraphicFramePr>
+              <a:graphicFrameLocks noChangeAspect="1"/>
+            </wp:cNvGraphicFramePr>
+            <a:graphic>
+              <a:graphicData uri="http://schemas.openxmlformats.org/drawingml/2006/picture">
+                <pic:pic>
+                  <pic:nvPicPr>
+                    <pic:cNvPr id="0" name="agile_06_product_backlog.png"/>
+                    <pic:cNvPicPr/>
+                  </pic:nvPicPr>
+                  <pic:blipFill>
+                    <a:blip r:embed="rId25"/>
+                    <a:stretch>
+                      <a:fillRect/>
+                    </a:stretch>
+                  </pic:blipFill>
+                  <pic:spPr>
+                    <a:xfrm>
+                      <a:off x="0" y="0"/>
+                      <a:ext cx="5669280" cy="3553087"/>
+                    </a:xfrm>
+                    <a:prstGeom prst="rect"/>
+                  </pic:spPr>
+                </pic:pic>
+              </a:graphicData>
+            </a:graphic>
+          </wp:inline>
+        </w:drawing>
+      </w:r>
+    </w:p>
+    <w:p>
+      <w:pPr>
+        <w:spacing w:after="280"/>
+        <w:jc w:val="center"/>
+      </w:pPr>
+      <w:r>
+        <w:rPr>
+          <w:i/>
+          <w:color w:val="555555"/>
+          <w:sz w:val="20"/>
+        </w:rPr>
+        <w:t>Figure 5.6: Product Backlog &amp; Sprint Backlog Management</w:t>
+      </w:r>
+    </w:p>
+    <w:p>
+      <w:pPr>
+        <w:spacing w:before="280" w:after="80"/>
+      </w:pPr>
+      <w:r>
+        <w:rPr>
+          <w:b/>
+          <w:sz w:val="26"/>
+        </w:rPr>
+        <w:t>5.7 Test Plan</w:t>
+      </w:r>
+    </w:p>
+    <w:p>
+      <w:pPr>
+        <w:spacing w:after="120"/>
+      </w:pPr>
+      <w:r>
+        <w:rPr>
+          <w:sz w:val="22"/>
+        </w:rPr>
+        <w:t>The Agile Test Plan outlines the test cases, test dates, action steps, expected vs. actual results, and verification status across mobile and web environments.</w:t>
+      </w:r>
+    </w:p>
+    <w:p>
+      <w:pPr>
+        <w:spacing w:after="80"/>
+        <w:jc w:val="center"/>
+      </w:pPr>
+      <w:r>
+        <w:drawing>
+          <wp:inline xmlns:a="http://schemas.openxmlformats.org/drawingml/2006/main" xmlns:pic="http://schemas.openxmlformats.org/drawingml/2006/picture">
+            <wp:extent cx="5669280" cy="3131965"/>
+            <wp:docPr id="19" name="Picture 19"/>
+            <wp:cNvGraphicFramePr>
+              <a:graphicFrameLocks noChangeAspect="1"/>
+            </wp:cNvGraphicFramePr>
+            <a:graphic>
+              <a:graphicData uri="http://schemas.openxmlformats.org/drawingml/2006/picture">
+                <pic:pic>
+                  <pic:nvPicPr>
+                    <pic:cNvPr id="0" name="agile_07_test_plan.png"/>
+                    <pic:cNvPicPr/>
+                  </pic:nvPicPr>
+                  <pic:blipFill>
+                    <a:blip r:embed="rId26"/>
+                    <a:stretch>
+                      <a:fillRect/>
+                    </a:stretch>
+                  </pic:blipFill>
+                  <pic:spPr>
+                    <a:xfrm>
+                      <a:off x="0" y="0"/>
+                      <a:ext cx="5669280" cy="3131965"/>
+                    </a:xfrm>
+                    <a:prstGeom prst="rect"/>
+                  </pic:spPr>
+                </pic:pic>
+              </a:graphicData>
+            </a:graphic>
+          </wp:inline>
+        </w:drawing>
+      </w:r>
+    </w:p>
+    <w:p>
+      <w:pPr>
+        <w:spacing w:after="280"/>
+        <w:jc w:val="center"/>
+      </w:pPr>
+      <w:r>
+        <w:rPr>
+          <w:i/>
+          <w:color w:val="555555"/>
+          <w:sz w:val="20"/>
+        </w:rPr>
+        <w:t>Figure 5.7: Agile Test Plan &amp; Quality Assurance Cases</w:t>
+      </w:r>
+    </w:p>
+    <w:p>
+      <w:pPr>
+        <w:spacing w:before="280" w:after="80"/>
+      </w:pPr>
+      <w:r>
+        <w:rPr>
+          <w:b/>
+          <w:sz w:val="26"/>
+        </w:rPr>
+        <w:t>5.8 Burndown Chart</w:t>
+      </w:r>
+    </w:p>
+    <w:p>
+      <w:pPr>
+        <w:spacing w:after="120"/>
+      </w:pPr>
+      <w:r>
+        <w:rPr>
+          <w:sz w:val="22"/>
+        </w:rPr>
+        <w:t>The Sprint Burndown Chart visualizes work remaining over a 14-day sprint cycle, tracking actual team velocity against planned benchmark hours.</w:t>
+      </w:r>
+    </w:p>
+    <w:p>
+      <w:pPr>
+        <w:spacing w:after="80"/>
+        <w:jc w:val="center"/>
+      </w:pPr>
+      <w:r>
+        <w:drawing>
+          <wp:inline xmlns:a="http://schemas.openxmlformats.org/drawingml/2006/main" xmlns:pic="http://schemas.openxmlformats.org/drawingml/2006/picture">
+            <wp:extent cx="5669280" cy="2611255"/>
+            <wp:docPr id="20" name="Picture 20"/>
+            <wp:cNvGraphicFramePr>
+              <a:graphicFrameLocks noChangeAspect="1"/>
+            </wp:cNvGraphicFramePr>
+            <a:graphic>
+              <a:graphicData uri="http://schemas.openxmlformats.org/drawingml/2006/picture">
+                <pic:pic>
+                  <pic:nvPicPr>
+                    <pic:cNvPr id="0" name="agile_08_burndown_chart.png"/>
+                    <pic:cNvPicPr/>
+                  </pic:nvPicPr>
+                  <pic:blipFill>
+                    <a:blip r:embed="rId27"/>
+                    <a:stretch>
+                      <a:fillRect/>
+                    </a:stretch>
+                  </pic:blipFill>
+                  <pic:spPr>
+                    <a:xfrm>
+                      <a:off x="0" y="0"/>
+                      <a:ext cx="5669280" cy="2611255"/>
+                    </a:xfrm>
+                    <a:prstGeom prst="rect"/>
+                  </pic:spPr>
+                </pic:pic>
+              </a:graphicData>
+            </a:graphic>
+          </wp:inline>
+        </w:drawing>
+      </w:r>
+    </w:p>
+    <w:p>
+      <w:pPr>
+        <w:spacing w:after="280"/>
+        <w:jc w:val="center"/>
+      </w:pPr>
+      <w:r>
+        <w:rPr>
+          <w:i/>
+          <w:color w:val="555555"/>
+          <w:sz w:val="20"/>
+        </w:rPr>
+        <w:t>Figure 5.8: Sprint Burndown Chart &amp; Velocity Tracking</w:t>
       </w:r>
     </w:p>
     <w:sectPr>

</xml_diff>